<commit_message>
Humaniser skill, proof-of-work outreach, CV attached, reply review
- New humaniser skill with a checker script; CLAUDE.md makes it
  mandatory for anything written in Adam's voice. CV rebuilt without
  em dashes and passes the checker.
- Outreach reworked: every cold email carries the CV plus an artefact
  made for that company (a note, a teardown, or a small build); the
  subject line is the finding. Four templates, all checker-clean, plus
  tagged variants for testing.
- Tracker gains variant, subject, artefact and reply_type columns.
- Skill gains a reply-review job: classify replies, draft answers,
  compare variants after 20 sends, propose the next test. Active once
  Gmail is connected.
- Urgency and warm-routes-first written into the skill and the
  Monday routine.

Co-Authored-By: Claude Fable 5.1 <noreply@anthropic.com>
Claude-Session: https://claude.ai/code/session_01Uz1qcSrQE9tcpxUzAkRBsd
</commit_message>
<xml_diff>
--- a/cv/Adam_Kanevsky_CV.docx
+++ b/cv/Adam_Kanevsky_CV.docx
@@ -477,7 +477,7 @@
                 <w:szCs w:val="17"/>
                 <w:rFonts w:ascii="Georgia" w:cs="Georgia" w:eastAsia="Georgia" w:hAnsi="Georgia"/>
               </w:rPr>
-              <w:t xml:space="preserve">Shadowed portfolio managers; attended the Goldman Sachs APAC Conference</w:t>
+              <w:t xml:space="preserve">Shadowed portfolio managers and attended the Goldman Sachs APAC Conference</w:t>
             </w:r>
           </w:p>
           <w:p>
@@ -579,7 +579,7 @@
                 <w:szCs w:val="18"/>
                 <w:rFonts w:ascii="Georgia" w:cs="Georgia" w:eastAsia="Georgia" w:hAnsi="Georgia"/>
               </w:rPr>
-              <w:t xml:space="preserve">Bachelor of Economics — Finance &amp; Financial Economics</w:t>
+              <w:t xml:space="preserve">Bachelor of Economics (Finance &amp; Financial Economics)</w:t>
             </w:r>
           </w:p>
           <w:p>
@@ -862,7 +862,7 @@
                 <w:szCs w:val="17"/>
                 <w:rFonts w:ascii="Georgia" w:cs="Georgia" w:eastAsia="Georgia" w:hAnsi="Georgia"/>
               </w:rPr>
-              <w:t xml:space="preserve"> — Education venture run end to end; an agent system turned ad and sales data into five-day scale-or-kill calls. A$194–281/day revenue on A$80/day ad spend.</w:t>
+              <w:t xml:space="preserve">. Education venture run end to end. An agent system turned ad and sales data into five-day scale-or-kill calls. A$194–281/day revenue on A$80/day ad spend.</w:t>
             </w:r>
           </w:p>
           <w:p>
@@ -885,7 +885,7 @@
                 <w:szCs w:val="17"/>
                 <w:rFonts w:ascii="Georgia" w:cs="Georgia" w:eastAsia="Georgia" w:hAnsi="Georgia"/>
               </w:rPr>
-              <w:t xml:space="preserve"> — Six interlocking Claude Code skills running a full content operation. github.com/adamkanevsky02-oss/agent-content-pipeline</w:t>
+              <w:t xml:space="preserve">. Six interlocking Claude Code skills running a full content operation. github.com/adamkanevsky02-oss/agent-content-pipeline</w:t>
             </w:r>
           </w:p>
           <w:p>
@@ -908,7 +908,7 @@
                 <w:szCs w:val="17"/>
                 <w:rFonts w:ascii="Georgia" w:cs="Georgia" w:eastAsia="Georgia" w:hAnsi="Georgia"/>
               </w:rPr>
-              <w:t xml:space="preserve"> — Multi-agent system running a wellness brand: three specialists and a Chief of Staff over a shared vault.</w:t>
+              <w:t xml:space="preserve">. Multi-agent system running a wellness brand: three specialists and a Chief of Staff over a shared vault.</w:t>
             </w:r>
           </w:p>
           <w:p>
@@ -931,7 +931,7 @@
                 <w:szCs w:val="17"/>
                 <w:rFonts w:ascii="Georgia" w:cs="Georgia" w:eastAsia="Georgia" w:hAnsi="Georgia"/>
               </w:rPr>
-              <w:t xml:space="preserve"> — CS50x final project. Python/Flask app parsing Claude Code sessions into weekly summaries via the Anthropic API.</w:t>
+              <w:t xml:space="preserve">. CS50x final project. Python/Flask app parsing Claude Code sessions into weekly summaries via the Anthropic API.</w:t>
             </w:r>
           </w:p>
           <w:p>
@@ -969,7 +969,7 @@
                 <w:szCs w:val="17"/>
                 <w:rFonts w:ascii="Georgia" w:cs="Georgia" w:eastAsia="Georgia" w:hAnsi="Georgia"/>
               </w:rPr>
-              <w:t xml:space="preserve">Hackathon winner — AI agent dashboard for Bipolar Australia</w:t>
+              <w:t xml:space="preserve">Hackathon winner: AI agent dashboard for Bipolar Australia</w:t>
             </w:r>
           </w:p>
           <w:p>

</xml_diff>